<commit_message>
assignment 3 design decisions
Signed-off-by: uofl-sbabb <sbabb131@gmail.com>
</commit_message>
<xml_diff>
--- a/Project3/Assignment3.docx
+++ b/Project3/Assignment3.docx
@@ -1728,6 +1728,1061 @@
     </w:p>
     <w:p>
       <w:pPr>
+        <w:pStyle w:val="ListParagraph"/>
+        <w:numPr>
+          <w:ilvl w:val="0"/>
+          <w:numId w:val="6"/>
+        </w:numPr>
+        <w:spacing w:before="100" w:beforeAutospacing="1" w:after="100" w:afterAutospacing="1" w:line="240" w:lineRule="auto"/>
+        <w:rPr>
+          <w:rFonts w:ascii="Times New Roman" w:eastAsia="Times New Roman" w:hAnsi="Times New Roman" w:cs="Times New Roman"/>
+          <w:kern w:val="0"/>
+          <w14:ligatures w14:val="none"/>
+        </w:rPr>
+      </w:pPr>
+      <w:r>
+        <w:rPr>
+          <w:rFonts w:ascii="Times New Roman" w:eastAsia="Times New Roman" w:hAnsi="Times New Roman" w:cs="Times New Roman"/>
+          <w:kern w:val="0"/>
+          <w14:ligatures w14:val="none"/>
+        </w:rPr>
+        <w:t>Here’s a clear, structured breakdown of each design choice with all three questions answered:</w:t>
+      </w:r>
+    </w:p>
+    <w:p>
+      <w:pPr>
+        <w:pStyle w:val="ListParagraph"/>
+        <w:numPr>
+          <w:ilvl w:val="0"/>
+          <w:numId w:val="6"/>
+        </w:numPr>
+        <w:spacing w:after="0" w:line="240" w:lineRule="auto"/>
+        <w:rPr>
+          <w:rFonts w:ascii="Times New Roman" w:eastAsia="Times New Roman" w:hAnsi="Times New Roman" w:cs="Times New Roman"/>
+          <w:kern w:val="0"/>
+          <w14:ligatures w14:val="none"/>
+        </w:rPr>
+      </w:pPr>
+      <w:r>
+        <w:pict w14:anchorId="5DCF75B4">
+          <v:rect id="_x0000_i1025" style="width:0;height:1.5pt" o:hralign="center" o:hrstd="t" o:hr="t" fillcolor="#a0a0a0" stroked="f"/>
+        </w:pict>
+      </w:r>
+    </w:p>
+    <w:p>
+      <w:pPr>
+        <w:pStyle w:val="ListParagraph"/>
+        <w:numPr>
+          <w:ilvl w:val="0"/>
+          <w:numId w:val="6"/>
+        </w:numPr>
+        <w:spacing w:after="0" w:line="240" w:lineRule="auto"/>
+        <w:rPr>
+          <w:rFonts w:ascii="Times New Roman" w:eastAsia="Times New Roman" w:hAnsi="Times New Roman" w:cs="Times New Roman"/>
+          <w:kern w:val="0"/>
+          <w14:ligatures w14:val="none"/>
+        </w:rPr>
+      </w:pPr>
+      <w:r>
+        <w:t>Population Growth Visualization:</w:t>
+      </w:r>
+    </w:p>
+    <w:p>
+      <w:pPr>
+        <w:pStyle w:val="ListParagraph"/>
+        <w:numPr>
+          <w:ilvl w:val="0"/>
+          <w:numId w:val="6"/>
+        </w:numPr>
+        <w:spacing w:before="100" w:beforeAutospacing="1" w:after="100" w:afterAutospacing="1" w:line="240" w:lineRule="auto"/>
+        <w:rPr>
+          <w:rFonts w:ascii="Times New Roman" w:eastAsia="Times New Roman" w:hAnsi="Times New Roman" w:cs="Times New Roman"/>
+          <w:kern w:val="0"/>
+          <w14:ligatures w14:val="none"/>
+        </w:rPr>
+      </w:pPr>
+      <w:r>
+        <w:rPr>
+          <w:rFonts w:ascii="Times New Roman" w:eastAsia="Times New Roman" w:hAnsi="Times New Roman" w:cs="Times New Roman"/>
+          <w:b/>
+          <w:bCs/>
+          <w:kern w:val="0"/>
+          <w14:ligatures w14:val="none"/>
+        </w:rPr>
+        <w:t>Why this method?</w:t>
+      </w:r>
+      <w:r>
+        <w:rPr>
+          <w:rFonts w:ascii="Times New Roman" w:eastAsia="Times New Roman" w:hAnsi="Times New Roman" w:cs="Times New Roman"/>
+          <w:kern w:val="0"/>
+          <w14:ligatures w14:val="none"/>
+        </w:rPr>
+        <w:br/>
+        <w:t xml:space="preserve">Using </w:t>
+      </w:r>
+      <w:r>
+        <w:rPr>
+          <w:rFonts w:ascii="Times New Roman" w:eastAsia="Times New Roman" w:hAnsi="Times New Roman" w:cs="Times New Roman"/>
+          <w:kern w:val="0"/>
+          <w14:ligatures w14:val="none"/>
+        </w:rPr>
+        <w:t>qualitative color encoding</w:t>
+      </w:r>
+      <w:r>
+        <w:rPr>
+          <w:rFonts w:ascii="Times New Roman" w:eastAsia="Times New Roman" w:hAnsi="Times New Roman" w:cs="Times New Roman"/>
+          <w:kern w:val="0"/>
+          <w14:ligatures w14:val="none"/>
+        </w:rPr>
+        <w:t xml:space="preserve"> (to distinguish categories like regions or countries) alongside </w:t>
+      </w:r>
+      <w:r>
+        <w:rPr>
+          <w:rFonts w:ascii="Times New Roman" w:eastAsia="Times New Roman" w:hAnsi="Times New Roman" w:cs="Times New Roman"/>
+          <w:kern w:val="0"/>
+          <w14:ligatures w14:val="none"/>
+        </w:rPr>
+        <w:t>positional/length encoding</w:t>
+      </w:r>
+      <w:r>
+        <w:rPr>
+          <w:rFonts w:ascii="Times New Roman" w:eastAsia="Times New Roman" w:hAnsi="Times New Roman" w:cs="Times New Roman"/>
+          <w:kern w:val="0"/>
+          <w14:ligatures w14:val="none"/>
+        </w:rPr>
+        <w:t xml:space="preserve"> (bar length or axis position) is effective because position and length are among the most accurate visual channels for comparing magnitude. Color then adds a second layer for grouping without interfering with value comparison.</w:t>
+      </w:r>
+    </w:p>
+    <w:p>
+      <w:pPr>
+        <w:pStyle w:val="ListParagraph"/>
+        <w:numPr>
+          <w:ilvl w:val="0"/>
+          <w:numId w:val="6"/>
+        </w:numPr>
+        <w:spacing w:before="100" w:beforeAutospacing="1" w:after="100" w:afterAutospacing="1" w:line="240" w:lineRule="auto"/>
+        <w:rPr>
+          <w:rFonts w:ascii="Times New Roman" w:eastAsia="Times New Roman" w:hAnsi="Times New Roman" w:cs="Times New Roman"/>
+          <w:kern w:val="0"/>
+          <w14:ligatures w14:val="none"/>
+        </w:rPr>
+      </w:pPr>
+      <w:r>
+        <w:rPr>
+          <w:rFonts w:ascii="Times New Roman" w:eastAsia="Times New Roman" w:hAnsi="Times New Roman" w:cs="Times New Roman"/>
+          <w:b/>
+          <w:bCs/>
+          <w:kern w:val="0"/>
+          <w14:ligatures w14:val="none"/>
+        </w:rPr>
+        <w:t>What would go wrong with another choice?</w:t>
+      </w:r>
+      <w:r>
+        <w:rPr>
+          <w:rFonts w:ascii="Times New Roman" w:eastAsia="Times New Roman" w:hAnsi="Times New Roman" w:cs="Times New Roman"/>
+          <w:kern w:val="0"/>
+          <w14:ligatures w14:val="none"/>
+        </w:rPr>
+        <w:br/>
+        <w:t>If you relied only on color (heatmap), viewers would struggle to accurately compare values because color perception is less precise than length. If you removed color entirely, group membership would be unclear, making it harder to see patterns across categories.</w:t>
+      </w:r>
+    </w:p>
+    <w:p>
+      <w:pPr>
+        <w:pStyle w:val="ListParagraph"/>
+        <w:numPr>
+          <w:ilvl w:val="0"/>
+          <w:numId w:val="6"/>
+        </w:numPr>
+        <w:spacing w:before="100" w:beforeAutospacing="1" w:after="100" w:afterAutospacing="1" w:line="240" w:lineRule="auto"/>
+        <w:rPr>
+          <w:rFonts w:ascii="Times New Roman" w:eastAsia="Times New Roman" w:hAnsi="Times New Roman" w:cs="Times New Roman"/>
+          <w:kern w:val="0"/>
+          <w14:ligatures w14:val="none"/>
+        </w:rPr>
+      </w:pPr>
+      <w:r>
+        <w:rPr>
+          <w:rFonts w:ascii="Times New Roman" w:eastAsia="Times New Roman" w:hAnsi="Times New Roman" w:cs="Times New Roman"/>
+          <w:b/>
+          <w:bCs/>
+          <w:kern w:val="0"/>
+          <w14:ligatures w14:val="none"/>
+        </w:rPr>
+        <w:t>What insight does this reveal?</w:t>
+      </w:r>
+      <w:r>
+        <w:rPr>
+          <w:rFonts w:ascii="Times New Roman" w:eastAsia="Times New Roman" w:hAnsi="Times New Roman" w:cs="Times New Roman"/>
+          <w:kern w:val="0"/>
+          <w14:ligatures w14:val="none"/>
+        </w:rPr>
+        <w:br/>
+        <w:t xml:space="preserve">This design makes it easy to simultaneously see </w:t>
+      </w:r>
+      <w:r>
+        <w:rPr>
+          <w:rFonts w:ascii="Times New Roman" w:eastAsia="Times New Roman" w:hAnsi="Times New Roman" w:cs="Times New Roman"/>
+          <w:kern w:val="0"/>
+          <w14:ligatures w14:val="none"/>
+        </w:rPr>
+        <w:t xml:space="preserve">which groups exist </w:t>
+      </w:r>
+      <w:r>
+        <w:rPr>
+          <w:rFonts w:ascii="Times New Roman" w:eastAsia="Times New Roman" w:hAnsi="Times New Roman" w:cs="Times New Roman"/>
+          <w:kern w:val="0"/>
+          <w14:ligatures w14:val="none"/>
+        </w:rPr>
+        <w:t xml:space="preserve">and </w:t>
+      </w:r>
+      <w:r>
+        <w:rPr>
+          <w:rFonts w:ascii="Times New Roman" w:eastAsia="Times New Roman" w:hAnsi="Times New Roman" w:cs="Times New Roman"/>
+          <w:kern w:val="0"/>
+          <w14:ligatures w14:val="none"/>
+        </w:rPr>
+        <w:t>how their populations compare</w:t>
+      </w:r>
+      <w:r>
+        <w:rPr>
+          <w:rFonts w:ascii="Times New Roman" w:eastAsia="Times New Roman" w:hAnsi="Times New Roman" w:cs="Times New Roman"/>
+          <w:kern w:val="0"/>
+          <w14:ligatures w14:val="none"/>
+        </w:rPr>
+        <w:t>, helping users quickly identify trends like which regions are growing fastest.</w:t>
+      </w:r>
+    </w:p>
+    <w:p>
+      <w:pPr>
+        <w:pStyle w:val="ListParagraph"/>
+        <w:numPr>
+          <w:ilvl w:val="0"/>
+          <w:numId w:val="6"/>
+        </w:numPr>
+        <w:spacing w:after="0" w:line="240" w:lineRule="auto"/>
+        <w:rPr>
+          <w:rFonts w:ascii="Times New Roman" w:eastAsia="Times New Roman" w:hAnsi="Times New Roman" w:cs="Times New Roman"/>
+          <w:kern w:val="0"/>
+          <w14:ligatures w14:val="none"/>
+        </w:rPr>
+      </w:pPr>
+      <w:r>
+        <w:pict w14:anchorId="7AE37592">
+          <v:rect id="_x0000_i1026" style="width:0;height:1.5pt" o:hralign="center" o:hrstd="t" o:hr="t" fillcolor="#a0a0a0" stroked="f"/>
+        </w:pict>
+      </w:r>
+    </w:p>
+    <w:p>
+      <w:pPr>
+        <w:pStyle w:val="ListParagraph"/>
+        <w:numPr>
+          <w:ilvl w:val="0"/>
+          <w:numId w:val="6"/>
+        </w:numPr>
+        <w:spacing w:after="0" w:line="240" w:lineRule="auto"/>
+        <w:rPr>
+          <w:rFonts w:ascii="Times New Roman" w:eastAsia="Times New Roman" w:hAnsi="Times New Roman" w:cs="Times New Roman"/>
+          <w:kern w:val="0"/>
+          <w14:ligatures w14:val="none"/>
+        </w:rPr>
+      </w:pPr>
+      <w:r>
+        <w:t>Choropleth Income:</w:t>
+      </w:r>
+    </w:p>
+    <w:p>
+      <w:pPr>
+        <w:pStyle w:val="ListParagraph"/>
+        <w:numPr>
+          <w:ilvl w:val="0"/>
+          <w:numId w:val="6"/>
+        </w:numPr>
+        <w:spacing w:before="100" w:beforeAutospacing="1" w:after="100" w:afterAutospacing="1" w:line="240" w:lineRule="auto"/>
+        <w:rPr>
+          <w:rFonts w:ascii="Times New Roman" w:eastAsia="Times New Roman" w:hAnsi="Times New Roman" w:cs="Times New Roman"/>
+          <w:kern w:val="0"/>
+          <w14:ligatures w14:val="none"/>
+        </w:rPr>
+      </w:pPr>
+      <w:r>
+        <w:rPr>
+          <w:rFonts w:ascii="Times New Roman" w:eastAsia="Times New Roman" w:hAnsi="Times New Roman" w:cs="Times New Roman"/>
+          <w:b/>
+          <w:bCs/>
+          <w:kern w:val="0"/>
+          <w14:ligatures w14:val="none"/>
+        </w:rPr>
+        <w:t>Why this method?</w:t>
+      </w:r>
+      <w:r>
+        <w:rPr>
+          <w:rFonts w:ascii="Times New Roman" w:eastAsia="Times New Roman" w:hAnsi="Times New Roman" w:cs="Times New Roman"/>
+          <w:kern w:val="0"/>
+          <w14:ligatures w14:val="none"/>
+        </w:rPr>
+        <w:br/>
+        <w:t xml:space="preserve">A </w:t>
+      </w:r>
+      <w:r>
+        <w:rPr>
+          <w:rFonts w:ascii="Times New Roman" w:eastAsia="Times New Roman" w:hAnsi="Times New Roman" w:cs="Times New Roman"/>
+          <w:kern w:val="0"/>
+          <w14:ligatures w14:val="none"/>
+        </w:rPr>
+        <w:t>sequential color scale</w:t>
+      </w:r>
+      <w:r>
+        <w:rPr>
+          <w:rFonts w:ascii="Times New Roman" w:eastAsia="Times New Roman" w:hAnsi="Times New Roman" w:cs="Times New Roman"/>
+          <w:kern w:val="0"/>
+          <w14:ligatures w14:val="none"/>
+        </w:rPr>
+        <w:t xml:space="preserve"> paired with </w:t>
+      </w:r>
+      <w:r>
+        <w:rPr>
+          <w:rFonts w:ascii="Times New Roman" w:eastAsia="Times New Roman" w:hAnsi="Times New Roman" w:cs="Times New Roman"/>
+          <w:kern w:val="0"/>
+          <w14:ligatures w14:val="none"/>
+        </w:rPr>
+        <w:t>geographic encoding</w:t>
+      </w:r>
+      <w:r>
+        <w:rPr>
+          <w:rFonts w:ascii="Times New Roman" w:eastAsia="Times New Roman" w:hAnsi="Times New Roman" w:cs="Times New Roman"/>
+          <w:kern w:val="0"/>
+          <w14:ligatures w14:val="none"/>
+        </w:rPr>
+        <w:t xml:space="preserve"> (map regions) is ideal for continuous data like income because it naturally represents low-to-high values across space.</w:t>
+      </w:r>
+    </w:p>
+    <w:p>
+      <w:pPr>
+        <w:pStyle w:val="ListParagraph"/>
+        <w:numPr>
+          <w:ilvl w:val="0"/>
+          <w:numId w:val="6"/>
+        </w:numPr>
+        <w:spacing w:before="100" w:beforeAutospacing="1" w:after="100" w:afterAutospacing="1" w:line="240" w:lineRule="auto"/>
+        <w:rPr>
+          <w:rFonts w:ascii="Times New Roman" w:eastAsia="Times New Roman" w:hAnsi="Times New Roman" w:cs="Times New Roman"/>
+          <w:kern w:val="0"/>
+          <w14:ligatures w14:val="none"/>
+        </w:rPr>
+      </w:pPr>
+      <w:r>
+        <w:rPr>
+          <w:rFonts w:ascii="Times New Roman" w:eastAsia="Times New Roman" w:hAnsi="Times New Roman" w:cs="Times New Roman"/>
+          <w:b/>
+          <w:bCs/>
+          <w:kern w:val="0"/>
+          <w14:ligatures w14:val="none"/>
+        </w:rPr>
+        <w:t>What would go wrong with another choice?</w:t>
+      </w:r>
+      <w:r>
+        <w:rPr>
+          <w:rFonts w:ascii="Times New Roman" w:eastAsia="Times New Roman" w:hAnsi="Times New Roman" w:cs="Times New Roman"/>
+          <w:kern w:val="0"/>
+          <w14:ligatures w14:val="none"/>
+        </w:rPr>
+        <w:br/>
+        <w:t>Using categorical colors would break the sense of progression in income levels. A non-spatial chart (bar chart) would remove geographic context, making it harder to see regional clusters or disparities.</w:t>
+      </w:r>
+    </w:p>
+    <w:p>
+      <w:pPr>
+        <w:pStyle w:val="ListParagraph"/>
+        <w:numPr>
+          <w:ilvl w:val="0"/>
+          <w:numId w:val="6"/>
+        </w:numPr>
+        <w:spacing w:before="100" w:beforeAutospacing="1" w:after="100" w:afterAutospacing="1" w:line="240" w:lineRule="auto"/>
+        <w:rPr>
+          <w:rFonts w:ascii="Times New Roman" w:eastAsia="Times New Roman" w:hAnsi="Times New Roman" w:cs="Times New Roman"/>
+          <w:kern w:val="0"/>
+          <w14:ligatures w14:val="none"/>
+        </w:rPr>
+      </w:pPr>
+      <w:r>
+        <w:rPr>
+          <w:rFonts w:ascii="Times New Roman" w:eastAsia="Times New Roman" w:hAnsi="Times New Roman" w:cs="Times New Roman"/>
+          <w:b/>
+          <w:bCs/>
+          <w:kern w:val="0"/>
+          <w14:ligatures w14:val="none"/>
+        </w:rPr>
+        <w:t>What insight does this reveal?</w:t>
+      </w:r>
+      <w:r>
+        <w:rPr>
+          <w:rFonts w:ascii="Times New Roman" w:eastAsia="Times New Roman" w:hAnsi="Times New Roman" w:cs="Times New Roman"/>
+          <w:kern w:val="0"/>
+          <w14:ligatures w14:val="none"/>
+        </w:rPr>
+        <w:br/>
+        <w:t xml:space="preserve">This design highlights </w:t>
+      </w:r>
+      <w:r>
+        <w:rPr>
+          <w:rFonts w:ascii="Times New Roman" w:eastAsia="Times New Roman" w:hAnsi="Times New Roman" w:cs="Times New Roman"/>
+          <w:kern w:val="0"/>
+          <w14:ligatures w14:val="none"/>
+        </w:rPr>
+        <w:t>spatial patterns and inequalities</w:t>
+      </w:r>
+      <w:r>
+        <w:rPr>
+          <w:rFonts w:ascii="Times New Roman" w:eastAsia="Times New Roman" w:hAnsi="Times New Roman" w:cs="Times New Roman"/>
+          <w:kern w:val="0"/>
+          <w14:ligatures w14:val="none"/>
+        </w:rPr>
+        <w:t>, allowing viewers to quickly see where income is concentrated and where lower-income areas are located.</w:t>
+      </w:r>
+    </w:p>
+    <w:p>
+      <w:pPr>
+        <w:pStyle w:val="ListParagraph"/>
+        <w:numPr>
+          <w:ilvl w:val="0"/>
+          <w:numId w:val="6"/>
+        </w:numPr>
+        <w:spacing w:after="0" w:line="240" w:lineRule="auto"/>
+        <w:rPr>
+          <w:rFonts w:ascii="Times New Roman" w:eastAsia="Times New Roman" w:hAnsi="Times New Roman" w:cs="Times New Roman"/>
+          <w:kern w:val="0"/>
+          <w14:ligatures w14:val="none"/>
+        </w:rPr>
+      </w:pPr>
+      <w:r>
+        <w:pict w14:anchorId="0322538F">
+          <v:rect id="_x0000_i1027" style="width:0;height:1.5pt" o:hralign="center" o:hrstd="t" o:hr="t" fillcolor="#a0a0a0" stroked="f"/>
+        </w:pict>
+      </w:r>
+    </w:p>
+    <w:p>
+      <w:pPr>
+        <w:pStyle w:val="ListParagraph"/>
+        <w:numPr>
+          <w:ilvl w:val="0"/>
+          <w:numId w:val="6"/>
+        </w:numPr>
+        <w:spacing w:after="0" w:line="240" w:lineRule="auto"/>
+        <w:rPr>
+          <w:rFonts w:ascii="Times New Roman" w:eastAsia="Times New Roman" w:hAnsi="Times New Roman" w:cs="Times New Roman"/>
+          <w:kern w:val="0"/>
+          <w14:ligatures w14:val="none"/>
+        </w:rPr>
+      </w:pPr>
+      <w:r>
+        <w:t>Diverging Scale Visualization:</w:t>
+      </w:r>
+    </w:p>
+    <w:p>
+      <w:pPr>
+        <w:pStyle w:val="ListParagraph"/>
+        <w:numPr>
+          <w:ilvl w:val="0"/>
+          <w:numId w:val="6"/>
+        </w:numPr>
+        <w:spacing w:before="100" w:beforeAutospacing="1" w:after="100" w:afterAutospacing="1" w:line="240" w:lineRule="auto"/>
+        <w:rPr>
+          <w:rFonts w:ascii="Times New Roman" w:eastAsia="Times New Roman" w:hAnsi="Times New Roman" w:cs="Times New Roman"/>
+          <w:kern w:val="0"/>
+          <w14:ligatures w14:val="none"/>
+        </w:rPr>
+      </w:pPr>
+      <w:r>
+        <w:rPr>
+          <w:rFonts w:ascii="Times New Roman" w:eastAsia="Times New Roman" w:hAnsi="Times New Roman" w:cs="Times New Roman"/>
+          <w:b/>
+          <w:bCs/>
+          <w:kern w:val="0"/>
+          <w14:ligatures w14:val="none"/>
+        </w:rPr>
+        <w:t>Why this method?</w:t>
+      </w:r>
+      <w:r>
+        <w:rPr>
+          <w:rFonts w:ascii="Times New Roman" w:eastAsia="Times New Roman" w:hAnsi="Times New Roman" w:cs="Times New Roman"/>
+          <w:kern w:val="0"/>
+          <w14:ligatures w14:val="none"/>
+        </w:rPr>
+        <w:br/>
+        <w:t xml:space="preserve">A </w:t>
+      </w:r>
+      <w:r>
+        <w:rPr>
+          <w:rFonts w:ascii="Times New Roman" w:eastAsia="Times New Roman" w:hAnsi="Times New Roman" w:cs="Times New Roman"/>
+          <w:kern w:val="0"/>
+          <w14:ligatures w14:val="none"/>
+        </w:rPr>
+        <w:t>diverging color scale</w:t>
+      </w:r>
+      <w:r>
+        <w:rPr>
+          <w:rFonts w:ascii="Times New Roman" w:eastAsia="Times New Roman" w:hAnsi="Times New Roman" w:cs="Times New Roman"/>
+          <w:kern w:val="0"/>
+          <w14:ligatures w14:val="none"/>
+        </w:rPr>
+        <w:t xml:space="preserve"> centered around a meaningful midpoint (national average) emphasizes </w:t>
+      </w:r>
+      <w:r>
+        <w:rPr>
+          <w:rFonts w:ascii="Times New Roman" w:eastAsia="Times New Roman" w:hAnsi="Times New Roman" w:cs="Times New Roman"/>
+          <w:kern w:val="0"/>
+          <w14:ligatures w14:val="none"/>
+        </w:rPr>
+        <w:t>deviation from that baseline</w:t>
+      </w:r>
+      <w:r>
+        <w:rPr>
+          <w:rFonts w:ascii="Times New Roman" w:eastAsia="Times New Roman" w:hAnsi="Times New Roman" w:cs="Times New Roman"/>
+          <w:kern w:val="0"/>
+          <w14:ligatures w14:val="none"/>
+        </w:rPr>
+        <w:t>, not just absolute values.</w:t>
+      </w:r>
+    </w:p>
+    <w:p>
+      <w:pPr>
+        <w:pStyle w:val="ListParagraph"/>
+        <w:numPr>
+          <w:ilvl w:val="0"/>
+          <w:numId w:val="6"/>
+        </w:numPr>
+        <w:spacing w:before="100" w:beforeAutospacing="1" w:after="100" w:afterAutospacing="1" w:line="240" w:lineRule="auto"/>
+        <w:rPr>
+          <w:rFonts w:ascii="Times New Roman" w:eastAsia="Times New Roman" w:hAnsi="Times New Roman" w:cs="Times New Roman"/>
+          <w:kern w:val="0"/>
+          <w14:ligatures w14:val="none"/>
+        </w:rPr>
+      </w:pPr>
+      <w:r>
+        <w:rPr>
+          <w:rFonts w:ascii="Times New Roman" w:eastAsia="Times New Roman" w:hAnsi="Times New Roman" w:cs="Times New Roman"/>
+          <w:b/>
+          <w:bCs/>
+          <w:kern w:val="0"/>
+          <w14:ligatures w14:val="none"/>
+        </w:rPr>
+        <w:lastRenderedPageBreak/>
+        <w:t>What would go wrong with another choice?</w:t>
+      </w:r>
+      <w:r>
+        <w:rPr>
+          <w:rFonts w:ascii="Times New Roman" w:eastAsia="Times New Roman" w:hAnsi="Times New Roman" w:cs="Times New Roman"/>
+          <w:kern w:val="0"/>
+          <w14:ligatures w14:val="none"/>
+        </w:rPr>
+        <w:br/>
+        <w:t>A sequential scale would only show magnitude (low to high) and obscure whether values are above or below the reference point. This makes it harder to interpret relative differences.</w:t>
+      </w:r>
+    </w:p>
+    <w:p>
+      <w:pPr>
+        <w:pStyle w:val="ListParagraph"/>
+        <w:numPr>
+          <w:ilvl w:val="0"/>
+          <w:numId w:val="6"/>
+        </w:numPr>
+        <w:spacing w:before="100" w:beforeAutospacing="1" w:after="100" w:afterAutospacing="1" w:line="240" w:lineRule="auto"/>
+        <w:rPr>
+          <w:rFonts w:ascii="Times New Roman" w:eastAsia="Times New Roman" w:hAnsi="Times New Roman" w:cs="Times New Roman"/>
+          <w:kern w:val="0"/>
+          <w14:ligatures w14:val="none"/>
+        </w:rPr>
+      </w:pPr>
+      <w:r>
+        <w:rPr>
+          <w:rFonts w:ascii="Times New Roman" w:eastAsia="Times New Roman" w:hAnsi="Times New Roman" w:cs="Times New Roman"/>
+          <w:b/>
+          <w:bCs/>
+          <w:kern w:val="0"/>
+          <w14:ligatures w14:val="none"/>
+        </w:rPr>
+        <w:t>What insight does this reveal?</w:t>
+      </w:r>
+      <w:r>
+        <w:rPr>
+          <w:rFonts w:ascii="Times New Roman" w:eastAsia="Times New Roman" w:hAnsi="Times New Roman" w:cs="Times New Roman"/>
+          <w:kern w:val="0"/>
+          <w14:ligatures w14:val="none"/>
+        </w:rPr>
+        <w:br/>
+        <w:t xml:space="preserve">It clearly shows </w:t>
+      </w:r>
+      <w:r>
+        <w:rPr>
+          <w:rFonts w:ascii="Times New Roman" w:eastAsia="Times New Roman" w:hAnsi="Times New Roman" w:cs="Times New Roman"/>
+          <w:kern w:val="0"/>
+          <w14:ligatures w14:val="none"/>
+        </w:rPr>
+        <w:t>which areas are above vs. below the norm</w:t>
+      </w:r>
+      <w:r>
+        <w:rPr>
+          <w:rFonts w:ascii="Times New Roman" w:eastAsia="Times New Roman" w:hAnsi="Times New Roman" w:cs="Times New Roman"/>
+          <w:kern w:val="0"/>
+          <w14:ligatures w14:val="none"/>
+        </w:rPr>
+        <w:t xml:space="preserve">, helping users understand </w:t>
+      </w:r>
+      <w:r>
+        <w:rPr>
+          <w:rFonts w:ascii="Times New Roman" w:eastAsia="Times New Roman" w:hAnsi="Times New Roman" w:cs="Times New Roman"/>
+          <w:kern w:val="0"/>
+          <w14:ligatures w14:val="none"/>
+        </w:rPr>
+        <w:t>imbalances and contrasts</w:t>
+      </w:r>
+      <w:r>
+        <w:rPr>
+          <w:rFonts w:ascii="Times New Roman" w:eastAsia="Times New Roman" w:hAnsi="Times New Roman" w:cs="Times New Roman"/>
+          <w:kern w:val="0"/>
+          <w14:ligatures w14:val="none"/>
+        </w:rPr>
+        <w:t>, not just totals.</w:t>
+      </w:r>
+    </w:p>
+    <w:p>
+      <w:pPr>
+        <w:pStyle w:val="ListParagraph"/>
+        <w:numPr>
+          <w:ilvl w:val="0"/>
+          <w:numId w:val="6"/>
+        </w:numPr>
+        <w:spacing w:after="0" w:line="240" w:lineRule="auto"/>
+        <w:rPr>
+          <w:rFonts w:ascii="Times New Roman" w:eastAsia="Times New Roman" w:hAnsi="Times New Roman" w:cs="Times New Roman"/>
+          <w:kern w:val="0"/>
+          <w14:ligatures w14:val="none"/>
+        </w:rPr>
+      </w:pPr>
+      <w:r>
+        <w:pict w14:anchorId="56EC4F9E">
+          <v:rect id="_x0000_i1028" style="width:0;height:1.5pt" o:hralign="center" o:hrstd="t" o:hr="t" fillcolor="#a0a0a0" stroked="f"/>
+        </w:pict>
+      </w:r>
+    </w:p>
+    <w:p>
+      <w:pPr>
+        <w:pStyle w:val="ListParagraph"/>
+        <w:numPr>
+          <w:ilvl w:val="0"/>
+          <w:numId w:val="6"/>
+        </w:numPr>
+        <w:spacing w:after="0" w:line="240" w:lineRule="auto"/>
+        <w:rPr>
+          <w:rFonts w:ascii="Times New Roman" w:eastAsia="Times New Roman" w:hAnsi="Times New Roman" w:cs="Times New Roman"/>
+          <w:kern w:val="0"/>
+          <w14:ligatures w14:val="none"/>
+        </w:rPr>
+      </w:pPr>
+      <w:r>
+        <w:t>Highlight Changes the Story:</w:t>
+      </w:r>
+    </w:p>
+    <w:p>
+      <w:pPr>
+        <w:pStyle w:val="ListParagraph"/>
+        <w:numPr>
+          <w:ilvl w:val="0"/>
+          <w:numId w:val="6"/>
+        </w:numPr>
+        <w:spacing w:before="100" w:beforeAutospacing="1" w:after="100" w:afterAutospacing="1" w:line="240" w:lineRule="auto"/>
+        <w:rPr>
+          <w:rFonts w:ascii="Times New Roman" w:eastAsia="Times New Roman" w:hAnsi="Times New Roman" w:cs="Times New Roman"/>
+          <w:kern w:val="0"/>
+          <w14:ligatures w14:val="none"/>
+        </w:rPr>
+      </w:pPr>
+      <w:r>
+        <w:rPr>
+          <w:rFonts w:ascii="Times New Roman" w:eastAsia="Times New Roman" w:hAnsi="Times New Roman" w:cs="Times New Roman"/>
+          <w:b/>
+          <w:bCs/>
+          <w:kern w:val="0"/>
+          <w14:ligatures w14:val="none"/>
+        </w:rPr>
+        <w:t>Why this method?</w:t>
+      </w:r>
+      <w:r>
+        <w:rPr>
+          <w:rFonts w:ascii="Times New Roman" w:eastAsia="Times New Roman" w:hAnsi="Times New Roman" w:cs="Times New Roman"/>
+          <w:kern w:val="0"/>
+          <w14:ligatures w14:val="none"/>
+        </w:rPr>
+        <w:br/>
+        <w:t xml:space="preserve">Using an </w:t>
+      </w:r>
+      <w:r>
+        <w:rPr>
+          <w:rFonts w:ascii="Times New Roman" w:eastAsia="Times New Roman" w:hAnsi="Times New Roman" w:cs="Times New Roman"/>
+          <w:kern w:val="0"/>
+          <w14:ligatures w14:val="none"/>
+        </w:rPr>
+        <w:t>accent (highlight) color</w:t>
+      </w:r>
+      <w:r>
+        <w:rPr>
+          <w:rFonts w:ascii="Times New Roman" w:eastAsia="Times New Roman" w:hAnsi="Times New Roman" w:cs="Times New Roman"/>
+          <w:kern w:val="0"/>
+          <w14:ligatures w14:val="none"/>
+        </w:rPr>
+        <w:t xml:space="preserve"> on top of a </w:t>
+      </w:r>
+      <w:r>
+        <w:rPr>
+          <w:rFonts w:ascii="Times New Roman" w:eastAsia="Times New Roman" w:hAnsi="Times New Roman" w:cs="Times New Roman"/>
+          <w:kern w:val="0"/>
+          <w14:ligatures w14:val="none"/>
+        </w:rPr>
+        <w:t>muted palette</w:t>
+      </w:r>
+      <w:r>
+        <w:rPr>
+          <w:rFonts w:ascii="Times New Roman" w:eastAsia="Times New Roman" w:hAnsi="Times New Roman" w:cs="Times New Roman"/>
+          <w:kern w:val="0"/>
+          <w14:ligatures w14:val="none"/>
+        </w:rPr>
+        <w:t xml:space="preserve"> in a </w:t>
+      </w:r>
+      <w:r>
+        <w:rPr>
+          <w:rFonts w:ascii="Times New Roman" w:eastAsia="Times New Roman" w:hAnsi="Times New Roman" w:cs="Times New Roman"/>
+          <w:kern w:val="0"/>
+          <w14:ligatures w14:val="none"/>
+        </w:rPr>
+        <w:t>sorted horizontal bar chart</w:t>
+      </w:r>
+      <w:r>
+        <w:rPr>
+          <w:rFonts w:ascii="Times New Roman" w:eastAsia="Times New Roman" w:hAnsi="Times New Roman" w:cs="Times New Roman"/>
+          <w:kern w:val="0"/>
+          <w14:ligatures w14:val="none"/>
+        </w:rPr>
+        <w:t xml:space="preserve"> creates a strong visual hierarchy. Sorting improves readability, and the highlight directs attention immediately.</w:t>
+      </w:r>
+    </w:p>
+    <w:p>
+      <w:pPr>
+        <w:pStyle w:val="ListParagraph"/>
+        <w:numPr>
+          <w:ilvl w:val="0"/>
+          <w:numId w:val="6"/>
+        </w:numPr>
+        <w:spacing w:before="100" w:beforeAutospacing="1" w:after="100" w:afterAutospacing="1" w:line="240" w:lineRule="auto"/>
+        <w:rPr>
+          <w:rFonts w:ascii="Times New Roman" w:eastAsia="Times New Roman" w:hAnsi="Times New Roman" w:cs="Times New Roman"/>
+          <w:kern w:val="0"/>
+          <w14:ligatures w14:val="none"/>
+        </w:rPr>
+      </w:pPr>
+      <w:r>
+        <w:rPr>
+          <w:rFonts w:ascii="Times New Roman" w:eastAsia="Times New Roman" w:hAnsi="Times New Roman" w:cs="Times New Roman"/>
+          <w:b/>
+          <w:bCs/>
+          <w:kern w:val="0"/>
+          <w14:ligatures w14:val="none"/>
+        </w:rPr>
+        <w:t>What would go wrong with another choice?</w:t>
+      </w:r>
+      <w:r>
+        <w:rPr>
+          <w:rFonts w:ascii="Times New Roman" w:eastAsia="Times New Roman" w:hAnsi="Times New Roman" w:cs="Times New Roman"/>
+          <w:kern w:val="0"/>
+          <w14:ligatures w14:val="none"/>
+        </w:rPr>
+        <w:br/>
+        <w:t>If all bars had equal visual weight, users would need to scan everything manually, increasing cognitive load. Without sorting, comparisons become slower and less intuitive.</w:t>
+      </w:r>
+    </w:p>
+    <w:p>
+      <w:pPr>
+        <w:pStyle w:val="ListParagraph"/>
+        <w:numPr>
+          <w:ilvl w:val="0"/>
+          <w:numId w:val="6"/>
+        </w:numPr>
+        <w:spacing w:before="100" w:beforeAutospacing="1" w:after="100" w:afterAutospacing="1" w:line="240" w:lineRule="auto"/>
+        <w:rPr>
+          <w:rFonts w:ascii="Times New Roman" w:eastAsia="Times New Roman" w:hAnsi="Times New Roman" w:cs="Times New Roman"/>
+          <w:kern w:val="0"/>
+          <w14:ligatures w14:val="none"/>
+        </w:rPr>
+      </w:pPr>
+      <w:r>
+        <w:rPr>
+          <w:rFonts w:ascii="Times New Roman" w:eastAsia="Times New Roman" w:hAnsi="Times New Roman" w:cs="Times New Roman"/>
+          <w:b/>
+          <w:bCs/>
+          <w:kern w:val="0"/>
+          <w14:ligatures w14:val="none"/>
+        </w:rPr>
+        <w:t>What insight does this reveal?</w:t>
+      </w:r>
+      <w:r>
+        <w:rPr>
+          <w:rFonts w:ascii="Times New Roman" w:eastAsia="Times New Roman" w:hAnsi="Times New Roman" w:cs="Times New Roman"/>
+          <w:kern w:val="0"/>
+          <w14:ligatures w14:val="none"/>
+        </w:rPr>
+        <w:br/>
+        <w:t xml:space="preserve">This design makes the </w:t>
+      </w:r>
+      <w:r>
+        <w:rPr>
+          <w:rFonts w:ascii="Times New Roman" w:eastAsia="Times New Roman" w:hAnsi="Times New Roman" w:cs="Times New Roman"/>
+          <w:kern w:val="0"/>
+          <w14:ligatures w14:val="none"/>
+        </w:rPr>
+        <w:t>key data point or trend instantly visible</w:t>
+      </w:r>
+      <w:r>
+        <w:rPr>
+          <w:rFonts w:ascii="Times New Roman" w:eastAsia="Times New Roman" w:hAnsi="Times New Roman" w:cs="Times New Roman"/>
+          <w:kern w:val="0"/>
+          <w14:ligatures w14:val="none"/>
+        </w:rPr>
+        <w:t xml:space="preserve"> while still preserving the broader context, helping users quickly understand “what matters most.”</w:t>
+      </w:r>
+    </w:p>
+    <w:p>
+      <w:pPr>
+        <w:pStyle w:val="ListParagraph"/>
+        <w:numPr>
+          <w:ilvl w:val="0"/>
+          <w:numId w:val="6"/>
+        </w:numPr>
+        <w:spacing w:after="0" w:line="240" w:lineRule="auto"/>
+        <w:rPr>
+          <w:rFonts w:ascii="Times New Roman" w:eastAsia="Times New Roman" w:hAnsi="Times New Roman" w:cs="Times New Roman"/>
+          <w:kern w:val="0"/>
+          <w14:ligatures w14:val="none"/>
+        </w:rPr>
+      </w:pPr>
+      <w:r>
+        <w:pict w14:anchorId="42B742DB">
+          <v:rect id="_x0000_i1029" style="width:0;height:1.5pt" o:hralign="center" o:hrstd="t" o:hr="t" fillcolor="#a0a0a0" stroked="f"/>
+        </w:pict>
+      </w:r>
+    </w:p>
+    <w:p>
+      <w:pPr>
+        <w:pStyle w:val="ListParagraph"/>
+        <w:numPr>
+          <w:ilvl w:val="0"/>
+          <w:numId w:val="6"/>
+        </w:numPr>
+        <w:spacing w:after="0" w:line="240" w:lineRule="auto"/>
+        <w:rPr>
+          <w:rFonts w:ascii="Times New Roman" w:eastAsia="Times New Roman" w:hAnsi="Times New Roman" w:cs="Times New Roman"/>
+          <w:kern w:val="0"/>
+          <w14:ligatures w14:val="none"/>
+        </w:rPr>
+      </w:pPr>
+      <w:r>
+        <w:t>Highlight Strategy:</w:t>
+      </w:r>
+    </w:p>
+    <w:p>
+      <w:pPr>
+        <w:pStyle w:val="ListParagraph"/>
+        <w:numPr>
+          <w:ilvl w:val="0"/>
+          <w:numId w:val="6"/>
+        </w:numPr>
+        <w:spacing w:before="100" w:beforeAutospacing="1" w:after="100" w:afterAutospacing="1" w:line="240" w:lineRule="auto"/>
+        <w:rPr>
+          <w:rFonts w:ascii="Times New Roman" w:eastAsia="Times New Roman" w:hAnsi="Times New Roman" w:cs="Times New Roman"/>
+          <w:kern w:val="0"/>
+          <w14:ligatures w14:val="none"/>
+        </w:rPr>
+      </w:pPr>
+      <w:r>
+        <w:rPr>
+          <w:rFonts w:ascii="Times New Roman" w:eastAsia="Times New Roman" w:hAnsi="Times New Roman" w:cs="Times New Roman"/>
+          <w:b/>
+          <w:bCs/>
+          <w:kern w:val="0"/>
+          <w14:ligatures w14:val="none"/>
+        </w:rPr>
+        <w:t>Why this method?</w:t>
+      </w:r>
+      <w:r>
+        <w:rPr>
+          <w:rFonts w:ascii="Times New Roman" w:eastAsia="Times New Roman" w:hAnsi="Times New Roman" w:cs="Times New Roman"/>
+          <w:kern w:val="0"/>
+          <w14:ligatures w14:val="none"/>
+        </w:rPr>
+        <w:br/>
+        <w:t xml:space="preserve">Highlighting one group while keeping others muted allows for </w:t>
+      </w:r>
+      <w:r>
+        <w:rPr>
+          <w:rFonts w:ascii="Times New Roman" w:eastAsia="Times New Roman" w:hAnsi="Times New Roman" w:cs="Times New Roman"/>
+          <w:kern w:val="0"/>
+          <w14:ligatures w14:val="none"/>
+        </w:rPr>
+        <w:t>focused comparison without losing context</w:t>
+      </w:r>
+      <w:r>
+        <w:rPr>
+          <w:rFonts w:ascii="Times New Roman" w:eastAsia="Times New Roman" w:hAnsi="Times New Roman" w:cs="Times New Roman"/>
+          <w:kern w:val="0"/>
+          <w14:ligatures w14:val="none"/>
+        </w:rPr>
+        <w:t>. It balances exploration (seeing all data) with emphasis (guiding attention).</w:t>
+      </w:r>
+    </w:p>
+    <w:p>
+      <w:pPr>
+        <w:pStyle w:val="ListParagraph"/>
+        <w:numPr>
+          <w:ilvl w:val="0"/>
+          <w:numId w:val="6"/>
+        </w:numPr>
+        <w:spacing w:before="100" w:beforeAutospacing="1" w:after="100" w:afterAutospacing="1" w:line="240" w:lineRule="auto"/>
+        <w:rPr>
+          <w:rFonts w:ascii="Times New Roman" w:eastAsia="Times New Roman" w:hAnsi="Times New Roman" w:cs="Times New Roman"/>
+          <w:kern w:val="0"/>
+          <w14:ligatures w14:val="none"/>
+        </w:rPr>
+      </w:pPr>
+      <w:r>
+        <w:rPr>
+          <w:rFonts w:ascii="Times New Roman" w:eastAsia="Times New Roman" w:hAnsi="Times New Roman" w:cs="Times New Roman"/>
+          <w:b/>
+          <w:bCs/>
+          <w:kern w:val="0"/>
+          <w14:ligatures w14:val="none"/>
+        </w:rPr>
+        <w:t>What would go wrong with another choice?</w:t>
+      </w:r>
+      <w:r>
+        <w:rPr>
+          <w:rFonts w:ascii="Times New Roman" w:eastAsia="Times New Roman" w:hAnsi="Times New Roman" w:cs="Times New Roman"/>
+          <w:kern w:val="0"/>
+          <w14:ligatures w14:val="none"/>
+        </w:rPr>
+        <w:br/>
+        <w:t>Highlighting too many elements reduces clarity, while removing context (showing only one group) prevents meaningful comparison. Both weaken analytical value.</w:t>
+      </w:r>
+    </w:p>
+    <w:p>
+      <w:pPr>
+        <w:pStyle w:val="ListParagraph"/>
+        <w:numPr>
+          <w:ilvl w:val="0"/>
+          <w:numId w:val="6"/>
+        </w:numPr>
+        <w:spacing w:before="100" w:beforeAutospacing="1" w:after="100" w:afterAutospacing="1" w:line="240" w:lineRule="auto"/>
+        <w:rPr>
+          <w:rFonts w:ascii="Times New Roman" w:eastAsia="Times New Roman" w:hAnsi="Times New Roman" w:cs="Times New Roman"/>
+          <w:kern w:val="0"/>
+          <w14:ligatures w14:val="none"/>
+        </w:rPr>
+      </w:pPr>
+      <w:r>
+        <w:rPr>
+          <w:rFonts w:ascii="Times New Roman" w:eastAsia="Times New Roman" w:hAnsi="Times New Roman" w:cs="Times New Roman"/>
+          <w:b/>
+          <w:bCs/>
+          <w:kern w:val="0"/>
+          <w14:ligatures w14:val="none"/>
+        </w:rPr>
+        <w:t>What insight does this reveal?</w:t>
+      </w:r>
+      <w:r>
+        <w:rPr>
+          <w:rFonts w:ascii="Times New Roman" w:eastAsia="Times New Roman" w:hAnsi="Times New Roman" w:cs="Times New Roman"/>
+          <w:kern w:val="0"/>
+          <w14:ligatures w14:val="none"/>
+        </w:rPr>
+        <w:br/>
+        <w:t xml:space="preserve">It enables users to </w:t>
+      </w:r>
+      <w:r>
+        <w:rPr>
+          <w:rFonts w:ascii="Times New Roman" w:eastAsia="Times New Roman" w:hAnsi="Times New Roman" w:cs="Times New Roman"/>
+          <w:kern w:val="0"/>
+          <w14:ligatures w14:val="none"/>
+        </w:rPr>
+        <w:t>deeply analyze one group while comparing it to the overall distribution</w:t>
+      </w:r>
+      <w:r>
+        <w:rPr>
+          <w:rFonts w:ascii="Times New Roman" w:eastAsia="Times New Roman" w:hAnsi="Times New Roman" w:cs="Times New Roman"/>
+          <w:kern w:val="0"/>
+          <w14:ligatures w14:val="none"/>
+        </w:rPr>
+        <w:t>, revealing patterns like outliers, trends, or disparities.</w:t>
+      </w:r>
+    </w:p>
+    <w:p>
+      <w:pPr>
+        <w:pStyle w:val="ListParagraph"/>
+        <w:numPr>
+          <w:ilvl w:val="0"/>
+          <w:numId w:val="6"/>
+        </w:numPr>
+        <w:spacing w:after="0" w:line="240" w:lineRule="auto"/>
+        <w:rPr>
+          <w:rFonts w:ascii="Times New Roman" w:eastAsia="Times New Roman" w:hAnsi="Times New Roman" w:cs="Times New Roman"/>
+          <w:kern w:val="0"/>
+          <w14:ligatures w14:val="none"/>
+        </w:rPr>
+      </w:pPr>
+      <w:r>
+        <w:pict w14:anchorId="0B8CAFF7">
+          <v:rect id="_x0000_i1030" style="width:0;height:1.5pt" o:hralign="center" o:hrstd="t" o:hr="t" fillcolor="#a0a0a0" stroked="f"/>
+        </w:pict>
+      </w:r>
+    </w:p>
+    <w:p>
+      <w:pPr>
+        <w:spacing w:before="100" w:beforeAutospacing="1" w:after="100" w:afterAutospacing="1" w:line="240" w:lineRule="auto"/>
+        <w:ind w:left="360"/>
+        <w:rPr>
+          <w:rFonts w:ascii="Times New Roman" w:eastAsia="Times New Roman" w:hAnsi="Times New Roman" w:cs="Times New Roman"/>
+          <w:kern w:val="0"/>
+          <w14:ligatures w14:val="none"/>
+        </w:rPr>
+      </w:pPr>
+    </w:p>
+    <w:p>
+      <w:pPr>
+        <w:spacing w:before="100" w:beforeAutospacing="1" w:after="100" w:afterAutospacing="1" w:line="240" w:lineRule="auto"/>
+        <w:ind w:left="720"/>
+        <w:rPr>
+          <w:rFonts w:asciiTheme="minorBidi" w:eastAsia="Times New Roman" w:hAnsiTheme="minorBidi"/>
+          <w:color w:val="000000"/>
+          <w:kern w:val="0"/>
+          <w:sz w:val="22"/>
+          <w:szCs w:val="22"/>
+          <w14:ligatures w14:val="none"/>
+        </w:rPr>
+      </w:pPr>
+    </w:p>
+    <w:p>
+      <w:pPr>
+        <w:spacing w:before="100" w:beforeAutospacing="1" w:after="100" w:afterAutospacing="1" w:line="240" w:lineRule="auto"/>
+        <w:ind w:left="720"/>
+        <w:rPr>
+          <w:rFonts w:asciiTheme="minorBidi" w:eastAsia="Times New Roman" w:hAnsiTheme="minorBidi"/>
+          <w:color w:val="000000"/>
+          <w:kern w:val="0"/>
+          <w:sz w:val="22"/>
+          <w:szCs w:val="22"/>
+          <w14:ligatures w14:val="none"/>
+        </w:rPr>
+      </w:pPr>
+    </w:p>
+    <w:p>
+      <w:pPr>
         <w:spacing w:after="0" w:line="240" w:lineRule="auto"/>
         <w:rPr>
           <w:rFonts w:asciiTheme="minorBidi" w:eastAsia="Times New Roman" w:hAnsiTheme="minorBidi"/>
@@ -1877,6 +2932,7 @@
           <w:szCs w:val="22"/>
           <w14:ligatures w14:val="none"/>
         </w:rPr>
+        <w:lastRenderedPageBreak/>
         <w:t>The </w:t>
       </w:r>
       <w:r>
@@ -2205,7 +3261,7 @@
         </mc:Choice>
         <mc:Fallback>
           <w:pict>
-            <v:rect w14:anchorId="37AC6EE8" id="Rectangle 23" o:spid="_x0000_s1026" style="position:absolute;margin-left:0;margin-top:0;width:468.5pt;height:21.3pt;z-index:-251657216;visibility:visible;mso-wrap-style:square;mso-width-percent:1000;mso-height-percent:27;mso-top-percent:45;mso-wrap-distance-left:9.35pt;mso-wrap-distance-top:0;mso-wrap-distance-right:9.35pt;mso-wrap-distance-bottom:0;mso-position-horizontal:center;mso-position-horizontal-relative:margin;mso-position-vertical-relative:page;mso-width-percent:1000;mso-height-percent:27;mso-top-percent:45;mso-width-relative:margin;mso-height-relative:page;v-text-anchor:middle" o:gfxdata="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" o:allowoverlap="f" fillcolor="#156082 [3204]" stroked="f" strokeweight="1pt">
+            <v:rect w14:anchorId="37AC6EE8" id="Rectangle 23" o:spid="_x0000_s1026" style="position:absolute;margin-left:0;margin-top:0;width:468.5pt;height:21.3pt;z-index:-251657216;visibility:visible;mso-wrap-style:square;mso-width-percent:1000;mso-height-percent:27;mso-top-percent:45;mso-wrap-distance-left:9.35pt;mso-wrap-distance-top:0;mso-wrap-distance-right:9.35pt;mso-wrap-distance-bottom:0;mso-position-horizontal:center;mso-position-horizontal-relative:margin;mso-position-vertical-relative:page;mso-width-percent:1000;mso-height-percent:27;mso-top-percent:45;mso-width-relative:margin;mso-height-relative:page;v-text-anchor:middle" o:gfxdata="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" o:allowoverlap="f" fillcolor="#156082 [3204]" stroked="f" strokeweight="1pt">
               <v:textbox style="mso-fit-shape-to-text:t">
                 <w:txbxContent>
                   <w:sdt>
@@ -3926,6 +4982,7 @@
   <w:style w:type="character" w:default="1" w:styleId="DefaultParagraphFont">
     <w:name w:val="Default Paragraph Font"/>
     <w:uiPriority w:val="1"/>
+    <w:semiHidden/>
     <w:unhideWhenUsed/>
   </w:style>
   <w:style w:type="table" w:default="1" w:styleId="TableNormal">

</xml_diff>